<commit_message>
Align pricing docs to mature platform
</commit_message>
<xml_diff>
--- a/docs/commercial/Meta_Clinic_FDE_Integration_Offer.docx
+++ b/docs/commercial/Meta_Clinic_FDE_Integration_Offer.docx
@@ -39,7 +39,7 @@
           <w:color w:val="000000"/>
           <w:sz w:val="21"/>
         </w:rPr>
-        <w:t>The FDE offer helps a clinic move from its current systems into Meta Clinic through a controlled, documented process. The FDE configures the clinic, maps approved data, coordinates integration or import work, validates the result with clinic staff and hands the configured workspace to clinic ownership. The FDE is an implementation role, not a general consultancy, clinician or clinic administrator.</w:t>
+        <w:t>The FDE offer helps a clinic move from its current systems into the fully completed Meta Clinic platform through a controlled, documented process. The FDE configures the clinic, maps approved data, coordinates pharmacy, supplier or other integration work, validates the result with clinic staff and hands the configured workspace to clinic ownership. The FDE is an implementation role, not a general consultancy, clinician or clinic administrator.</w:t>
       </w:r>
     </w:p>
     <w:p>
@@ -958,7 +958,7 @@
                 <w:color w:val="000000"/>
                 <w:sz w:val="17"/>
               </w:rPr>
-              <w:t>$3,000-$6,000</w:t>
+              <w:t>$5,000-$10,000</w:t>
             </w:r>
           </w:p>
         </w:tc>
@@ -1065,7 +1065,7 @@
                 <w:color w:val="000000"/>
                 <w:sz w:val="17"/>
               </w:rPr>
-              <w:t>$7,500-$15,000</w:t>
+              <w:t>$10,000-$20,000</w:t>
             </w:r>
           </w:p>
         </w:tc>
@@ -1135,7 +1135,7 @@
                 <w:color w:val="000000"/>
                 <w:sz w:val="17"/>
               </w:rPr>
-              <w:t>Custom APIs, multiple sites, incomplete or high-volume records, or exceptional rollback needs.</w:t>
+              <w:t>Custom pharmacy/supplier APIs, multiple sites, incomplete or high-volume records, or exceptional rollback needs.</w:t>
             </w:r>
           </w:p>
         </w:tc>
@@ -1169,7 +1169,7 @@
                 <w:color w:val="000000"/>
                 <w:sz w:val="17"/>
               </w:rPr>
-              <w:t>Quote after discovery</w:t>
+              <w:t>$20,000-$40,000+</w:t>
             </w:r>
           </w:p>
         </w:tc>
@@ -1460,6 +1460,77 @@
                 <w:color w:val="000000"/>
                 <w:sz w:val="17"/>
               </w:rPr>
+              <w:t>Approved pharmacy, supplier and inventory integration coordination when contracted</w:t>
+            </w:r>
+          </w:p>
+        </w:tc>
+        <w:tc>
+          <w:tcPr>
+            <w:tcW w:type="dxa" w:w="5112"/>
+            <w:vAlign w:val="center"/>
+            <w:tcBorders>
+              <w:top w:val="single" w:sz="6" w:space="0" w:color="D9D9D9"/>
+              <w:left w:val="single" w:sz="6" w:space="0" w:color="D9D9D9"/>
+              <w:bottom w:val="single" w:sz="6" w:space="0" w:color="D9D9D9"/>
+              <w:right w:val="single" w:sz="6" w:space="0" w:color="D9D9D9"/>
+              <w:insideH w:val="single" w:sz="6" w:space="0" w:color="D9D9D9"/>
+              <w:insideV w:val="single" w:sz="6" w:space="0" w:color="D9D9D9"/>
+            </w:tcBorders>
+            <w:tcMar>
+              <w:top w:w="90" w:type="dxa"/>
+              <w:start w:w="110" w:type="dxa"/>
+              <w:bottom w:w="90" w:type="dxa"/>
+              <w:end w:w="110" w:type="dxa"/>
+            </w:tcMar>
+          </w:tcPr>
+          <w:p>
+            <w:pPr>
+              <w:spacing w:after="0" w:line="240" w:lineRule="auto"/>
+            </w:pPr>
+            <w:r>
+              <w:rPr>
+                <w:rFonts w:ascii="Arial" w:hAnsi="Arial"/>
+                <w:b w:val="0"/>
+                <w:color w:val="000000"/>
+                <w:sz w:val="17"/>
+              </w:rPr>
+              <w:t>Live pharmacy/supplier access without approved contracts, credentials and acceptance</w:t>
+            </w:r>
+          </w:p>
+        </w:tc>
+      </w:tr>
+      <w:tr>
+        <w:tc>
+          <w:tcPr>
+            <w:tcW w:type="dxa" w:w="4824"/>
+            <w:vAlign w:val="center"/>
+            <w:tcBorders>
+              <w:top w:val="single" w:sz="6" w:space="0" w:color="D9D9D9"/>
+              <w:left w:val="single" w:sz="6" w:space="0" w:color="D9D9D9"/>
+              <w:bottom w:val="single" w:sz="6" w:space="0" w:color="D9D9D9"/>
+              <w:right w:val="single" w:sz="6" w:space="0" w:color="D9D9D9"/>
+              <w:insideH w:val="single" w:sz="6" w:space="0" w:color="D9D9D9"/>
+              <w:insideV w:val="single" w:sz="6" w:space="0" w:color="D9D9D9"/>
+            </w:tcBorders>
+            <w:tcMar>
+              <w:top w:w="90" w:type="dxa"/>
+              <w:start w:w="110" w:type="dxa"/>
+              <w:bottom w:w="90" w:type="dxa"/>
+              <w:end w:w="110" w:type="dxa"/>
+            </w:tcMar>
+            <w:shd w:fill="EAF2F8"/>
+          </w:tcPr>
+          <w:p>
+            <w:pPr>
+              <w:spacing w:after="0" w:line="240" w:lineRule="auto"/>
+            </w:pPr>
+            <w:r>
+              <w:rPr>
+                <w:rFonts w:ascii="Arial" w:hAnsi="Arial"/>
+                <w:b w:val="0"/>
+                <w:color w:val="000000"/>
+                <w:sz w:val="17"/>
+              </w:rPr>
               <w:t>Configuration of supported Meta Clinic settings</w:t>
             </w:r>
           </w:p>
@@ -1482,6 +1553,7 @@
               <w:bottom w:w="90" w:type="dxa"/>
               <w:end w:w="110" w:type="dxa"/>
             </w:tcMar>
+            <w:shd w:fill="EAF2F8"/>
           </w:tcPr>
           <w:p>
             <w:pPr>
@@ -1518,7 +1590,6 @@
               <w:bottom w:w="90" w:type="dxa"/>
               <w:end w:w="110" w:type="dxa"/>
             </w:tcMar>
-            <w:shd w:fill="EAF2F8"/>
           </w:tcPr>
           <w:p>
             <w:pPr>
@@ -1553,7 +1624,6 @@
               <w:bottom w:w="90" w:type="dxa"/>
               <w:end w:w="110" w:type="dxa"/>
             </w:tcMar>
-            <w:shd w:fill="EAF2F8"/>
           </w:tcPr>
           <w:p>
             <w:pPr>
@@ -1590,6 +1660,7 @@
               <w:bottom w:w="90" w:type="dxa"/>
               <w:end w:w="110" w:type="dxa"/>
             </w:tcMar>
+            <w:shd w:fill="EAF2F8"/>
           </w:tcPr>
           <w:p>
             <w:pPr>
@@ -1624,6 +1695,7 @@
               <w:bottom w:w="90" w:type="dxa"/>
               <w:end w:w="110" w:type="dxa"/>
             </w:tcMar>
+            <w:shd w:fill="EAF2F8"/>
           </w:tcPr>
           <w:p>
             <w:pPr>

</xml_diff>